<commit_message>
Semantic evidence matching: embedding seat + kind constraints + global assignment; real-corpus intake proven
Co-Authored-By: Claude Fable 5 <noreply@anthropic.com>
</commit_message>
<xml_diff>
--- a/docs/design/IQR_Design_Document_v4.docx
+++ b/docs/design/IQR_Design_Document_v4.docx
@@ -1029,7 +1029,7 @@
         <w:spacing w:after="70"/>
       </w:pPr>
       <w:r>
-        <w:t xml:space="preserve">Infers the control mechanically: every frozen plan version is scored by required-evidence coverage; the best-fitting version per control is ranked (packages from different periods legitimately match different versions).</w:t>
+        <w:t xml:space="preserve">Infers the control mechanically: every frozen plan version is scored by required-evidence coverage. Matching is two-pass: exact name matching first, then SEMANTIC matching by an embedding seat — each artifact's content signals (path, kind, sheet names, email subject and opening lines, document paragraphs) embedded against each plan item's meaning, constrained by the artifact kind the reading checks demand (a sign-off check needs an email; a numeric check needs a workbook), assigned globally best-pair-first. Every match records its method, score, and embedding backend in the ledger. The embedding seat degrades visibly to a deterministic offline vectorizer.</w:t>
       </w:r>
     </w:p>
     <w:p>
@@ -3195,6 +3195,77 @@
                 <w:szCs w:val="18"/>
               </w:rPr>
               <w:t xml:space="preserve">Per-seat routing; temperature 0 + pinned seed where permitted; offline stub as terminal fallback</w:t>
+            </w:r>
+          </w:p>
+        </w:tc>
+      </w:tr>
+      <w:tr>
+        <w:tc>
+          <w:tcPr>
+            <w:tcW w:type="dxa" w:w="2100"/>
+            <w:tcMar>
+              <w:top w:type="dxa" w:w="60"/>
+              <w:left w:type="dxa" w:w="100"/>
+              <w:bottom w:type="dxa" w:w="60"/>
+              <w:right w:type="dxa" w:w="100"/>
+            </w:tcMar>
+          </w:tcPr>
+          <w:p>
+            <w:r>
+              <w:rPr>
+                <w:b w:val="false"/>
+                <w:bCs w:val="false"/>
+                <w:color w:val="101820"/>
+                <w:sz w:val="18"/>
+                <w:szCs w:val="18"/>
+              </w:rPr>
+              <w:t xml:space="preserve">Embedding seat</w:t>
+            </w:r>
+          </w:p>
+        </w:tc>
+        <w:tc>
+          <w:tcPr>
+            <w:tcW w:type="dxa" w:w="2800"/>
+            <w:tcMar>
+              <w:top w:type="dxa" w:w="60"/>
+              <w:left w:type="dxa" w:w="100"/>
+              <w:bottom w:type="dxa" w:w="60"/>
+              <w:right w:type="dxa" w:w="100"/>
+            </w:tcMar>
+          </w:tcPr>
+          <w:p>
+            <w:r>
+              <w:rPr>
+                <w:b w:val="false"/>
+                <w:bCs w:val="false"/>
+                <w:color w:val="101820"/>
+                <w:sz w:val="18"/>
+                <w:szCs w:val="18"/>
+              </w:rPr>
+              <w:t xml:space="preserve">Foundry embedding deployment (text-embedding-3-small)</w:t>
+            </w:r>
+          </w:p>
+        </w:tc>
+        <w:tc>
+          <w:tcPr>
+            <w:tcW w:type="dxa" w:w="4740"/>
+            <w:tcMar>
+              <w:top w:type="dxa" w:w="60"/>
+              <w:left w:type="dxa" w:w="100"/>
+              <w:bottom w:type="dxa" w:w="60"/>
+              <w:right w:type="dxa" w:w="100"/>
+            </w:tcMar>
+          </w:tcPr>
+          <w:p>
+            <w:r>
+              <w:rPr>
+                <w:b w:val="false"/>
+                <w:bCs w:val="false"/>
+                <w:color w:val="101820"/>
+                <w:sz w:val="18"/>
+                <w:szCs w:val="18"/>
+              </w:rPr>
+              <w:t xml:space="preserve">Semantic artifact-to-evidence matching; deterministic hashed vectorizer as offline fallback</w:t>
             </w:r>
           </w:p>
         </w:tc>

</xml_diff>